<commit_message>
thêm chức năng hàng đợi audio
</commit_message>
<xml_diff>
--- a/PRD_SmartTourGuide_v1.docx
+++ b/PRD_SmartTourGuide_v1.docx
@@ -2373,11 +2373,41 @@
               <w:rPr>
                 <w:b/>
                 <w:bCs/>
+                <w:color w:val="2D6A4F"/>
+                <w:sz w:val="16"/>
+                <w:szCs w:val="16"/>
+              </w:rPr>
+              <w:t>✔</w:t>
+            </w:r>
+            <w:r>
+              <w:rPr>
+                <w:b/>
+                <w:bCs/>
                 <w:color w:val="6C757D"/>
                 <w:sz w:val="18"/>
                 <w:szCs w:val="18"/>
               </w:rPr>
-              <w:t xml:space="preserve">⏳ Roadmap: </w:t>
+              <w:t xml:space="preserve"> </w:t>
+            </w:r>
+            <w:r>
+              <w:rPr>
+                <w:b/>
+                <w:bCs/>
+                <w:color w:val="2D6A4F"/>
+                <w:sz w:val="16"/>
+                <w:szCs w:val="16"/>
+              </w:rPr>
+              <w:t>ĐÃ HOÀN THÀNH</w:t>
+            </w:r>
+            <w:r>
+              <w:rPr>
+                <w:b/>
+                <w:bCs/>
+                <w:color w:val="6C757D"/>
+                <w:sz w:val="18"/>
+                <w:szCs w:val="18"/>
+              </w:rPr>
+              <w:t xml:space="preserve">: </w:t>
             </w:r>
           </w:p>
           <w:p>
@@ -2572,7 +2602,7 @@
                 <w:sz w:val="20"/>
                 <w:szCs w:val="20"/>
               </w:rPr>
-              <w:t>Trình phát Audio &amp; TTS</w:t>
+              <w:t>Trình phát Audio</w:t>
             </w:r>
           </w:p>
         </w:tc>
@@ -2599,7 +2629,7 @@
                 <w:sz w:val="20"/>
                 <w:szCs w:val="20"/>
               </w:rPr>
-              <w:t>Ưu tiên phát file MP3 ghi âm sẵn. Fallback: TTS đọc văn bản mô tả. Hỗ trợ chuyển đổi ngôn ngữ.</w:t>
+              <w:t>Ưu tiên phát file MP3 ghi âm sẵn.Hỗ trợ chuyển đổi ngôn ngữ.</w:t>
             </w:r>
           </w:p>
         </w:tc>

</xml_diff>

<commit_message>
chỉnh sửa lại tour
</commit_message>
<xml_diff>
--- a/PRD_SmartTourGuide_v1.docx
+++ b/PRD_SmartTourGuide_v1.docx
@@ -2655,11 +2655,21 @@
               <w:rPr>
                 <w:b/>
                 <w:bCs/>
+                <w:color w:val="2D6A4F"/>
+                <w:sz w:val="16"/>
+                <w:szCs w:val="16"/>
+              </w:rPr>
+              <w:t>✔ ĐÃ HOÀN THÀNH</w:t>
+            </w:r>
+            <w:r>
+              <w:rPr>
+                <w:b/>
+                <w:bCs/>
                 <w:color w:val="6C757D"/>
                 <w:sz w:val="18"/>
                 <w:szCs w:val="18"/>
               </w:rPr>
-              <w:t xml:space="preserve">⏳ Roadmap: </w:t>
+              <w:t xml:space="preserve">: </w:t>
             </w:r>
           </w:p>
           <w:p>

</xml_diff>